<commit_message>
Lecture page: tailor to ECE 4433/5433, add the decision-model slide
Title slide names the course, slide 13 covers PLCs and deterministic
control, and a new slide 14 places fast decision models (e.g. Jev)
between the PLC scan cycle and LLM agents. 18 slides now.

Co-Authored-By: Claude Opus 5.5 (1M context) <noreply@anthropic.com>
</commit_message>
<xml_diff>
--- a/public/automation-presentation/LLMs-for-Measurement-and-Automation_Arash-Ahmadi_transcript.docx
+++ b/public/automation-presentation/LLMs-for-Measurement-and-Automation_Arash-Ahmadi_transcript.docx
@@ -18,7 +18,7 @@
         <w:rPr>
           <w:i/>
         </w:rPr>
-        <w:t>Guest lecture transcript for Dr. Sarah Sharif's class. Arash Ahmadi, INQUIRE Lab, The University of Oklahoma. Planned length: about 45 minutes plus questions. Times in brackets are targets for each slide.</w:t>
+        <w:t>Guest lecture transcript for ECE 4433/5433, Measurement and Automation, taught by Dr. Sarah Sharif. Arash Ahmadi, INQUIRE Lab, The University of Oklahoma. Planned length: about 45 minutes plus questions. Times in brackets are targets for each slide.</w:t>
       </w:r>
     </w:p>
     <w:p>
@@ -76,7 +76,7 @@
         <w:spacing w:after="160"/>
       </w:pPr>
       <w:r>
-        <w:t>Good morning, everyone. My name is Arash Ahmadi. I am a PhD student in Electrical and Computer Engineering here at OU, and I work in the INQUIRE Lab, where most of my research is about training large language models and understanding what happens inside them. I want to thank Dr. Sharif for inviting me today.</w:t>
+        <w:t>Good morning, everyone. My name is Arash Ahmadi. I am a PhD student in Electrical and Computer Engineering here at OU, and I work in the INQUIRE Lab, where most of my research is about training large language models and understanding what happens inside them. I want to thank Dr. Sharif for inviting me to Measurement and Automation today.</w:t>
       </w:r>
     </w:p>
     <w:p>
@@ -84,7 +84,7 @@
         <w:spacing w:after="160"/>
       </w:pPr>
       <w:r>
-        <w:t>You have probably all used ChatGPT or something like it. Today I want to open the box. I will show you what a language model actually computes, with the real math, and then we will look at something I think fits this class very well: how one of these models sees a measurement. We will take a simple sine wave, the kind you see on an oscilloscope every week, and follow it all the way into the model. After that we will talk about how you can put these models to work in a real lab without letting them break your instruments or invent your data.</w:t>
+        <w:t>You have probably all used ChatGPT or something like it. Today I want to open the box. I will show you what a language model actually computes, with the real math, and then we will look at something I think fits this class very well: how one of these models sees a measurement. We will take a simple sine wave, the kind you see on an oscilloscope every week, and follow it all the way into the model. After that we will talk about how you can put these models to work next to your PLCs and your LabVIEW programs, without letting them break your instruments or invent your data.</w:t>
       </w:r>
     </w:p>
     <w:p>
@@ -1077,7 +1077,7 @@
         <w:rPr>
           <w:color w:val="841617"/>
         </w:rPr>
-        <w:t>Slide 13: Where this fits with LabVIEW and your bench [3 minutes]</w:t>
+        <w:t>Slide 13: Where this fits with PLCs, LabVIEW and your bench [3 minutes]</w:t>
       </w:r>
     </w:p>
     <w:p>
@@ -1124,7 +1124,7 @@
         <w:spacing w:after="160"/>
       </w:pPr>
       <w:r>
-        <w:t>How does this connect to what you do in this class with LabVIEW? I see three roles.</w:t>
+        <w:t>How does this connect to what you do in this class? You spend half the semester on PLCs and half on LabVIEW, so let me place the language model next to both. I see three roles.</w:t>
       </w:r>
     </w:p>
     <w:p>
@@ -1132,7 +1132,7 @@
         <w:spacing w:after="160"/>
       </w:pPr>
       <w:r>
-        <w:t>The first column is writing the automation. You can give a model a plain language test plan and ask it to generate a Python and PyVISA or SCPI script. You can give it an existing LabVIEW VI and ask it to explain it block by block, which is very helpful when you inherit someone else's project. It can also draft test procedures and checklists.</w:t>
+        <w:t>The first column is writing the automation. You can give a model a written sequence of operations, for example: when the start button is pressed and the guard is closed, run the conveyor until the sensor sees a part. Then you ask it to draft the PLC logic. You still read every rung yourself and test it in simulation before it goes near a machine. You can also hand it an existing LabVIEW VI or a PLC program and ask it to explain it block by block or rung by rung, which is very helpful when you inherit someone else's project. And it can turn a test plan into a Python script with PyVISA or SCPI commands.</w:t>
       </w:r>
     </w:p>
     <w:p>
@@ -1140,7 +1140,7 @@
         <w:spacing w:after="160"/>
       </w:pPr>
       <w:r>
-        <w:t>The second column is understanding the data. A model is good at reading a long log and flagging the parts that look unusual. It can suggest likely causes for a strange measurement, like a grounding problem, aliasing because the sample rate is too low, or loading because your probe or your next stage changes the circuit. It can also turn your results into a first draft of a lab report, which you then check and correct.</w:t>
+        <w:t>The second column is understanding the data. A model is good at reading a long log and flagging the parts that look unusual. It can suggest likely causes for a strange measurement: a grounding problem, aliasing because the sample rate is too low, loading because your probe or your next stage changes the circuit, or simply a stuck sensor. It can also turn your results into a first draft of a lab report, which you then check and correct.</w:t>
       </w:r>
     </w:p>
     <w:p>
@@ -1148,7 +1148,7 @@
         <w:spacing w:after="160"/>
       </w:pPr>
       <w:r>
-        <w:t>The third column is the most important one: keep humans in the loop. Instrument limits, like the maximum voltage or current, must be enforced in code, never only by asking the model nicely in the prompt. A human approves anything before it touches real hardware. And every number that goes into a report must be traced back to an actual measurement.</w:t>
+        <w:t>The third column is the most important one for this class: keep control deterministic. A PLC runs its program in a fixed scan cycle. It reads every input, runs the logic, and writes every output, often every few milliseconds, and it does exactly the same thing every time. A language model takes seconds to answer, and it can give a different answer to the same question. So the real time control loop always stays in the PLC or in LabVIEW, never in the language model. Interlocks and limits, like the maximum voltage or the rule that a press cannot move while the guard is open, live in the controller and not in a prompt. And a human approves any change before it reaches the hardware.</w:t>
       </w:r>
     </w:p>
     <w:p>
@@ -1156,7 +1156,15 @@
         <w:spacing w:after="160"/>
       </w:pPr>
       <w:r>
-        <w:t>The sentence at the bottom sums it up. The language model is the lab assistant that writes and explains. The instruments and the code do the measuring.</w:t>
+        <w:t>The sentence at the bottom sums it up. The language model writes and explains. The PLC and LabVIEW measure and control.</w:t>
+      </w:r>
+    </w:p>
+    <w:p>
+      <w:pPr>
+        <w:spacing w:after="160"/>
+      </w:pPr>
+      <w:r>
+        <w:t>But there is a newer kind of model that sits in between these two worlds, and it matters a lot for automation. That is the next slide.</w:t>
       </w:r>
     </w:p>
     <w:p>
@@ -1167,7 +1175,7 @@
         <w:rPr>
           <w:color w:val="841617"/>
         </w:rPr>
-        <w:t>Slide 14: Pitfalls you will actually hit [3 minutes]</w:t>
+        <w:t>Slide 14: The middle ground: fast decision models [3 minutes]</w:t>
       </w:r>
     </w:p>
     <w:p>
@@ -1186,7 +1194,7 @@
               <a:graphicData uri="http://schemas.openxmlformats.org/drawingml/2006/picture">
                 <pic:pic>
                   <pic:nvPicPr>
-                    <pic:cNvPr id="0" name="14-pitfalls.jpg"/>
+                    <pic:cNvPr id="0" name="14-decision-models.jpg"/>
                     <pic:cNvPicPr/>
                   </pic:nvPicPr>
                   <pic:blipFill>
@@ -1214,7 +1222,7 @@
         <w:spacing w:after="160"/>
       </w:pPr>
       <w:r>
-        <w:t>If you start using these models in the lab, these are the five problems you will actually run into.</w:t>
+        <w:t>I just told you the language model never runs the control loop. That is true for chat models, but a newer kind of model sits in between.</w:t>
       </w:r>
     </w:p>
     <w:p>
@@ -1222,7 +1230,7 @@
         <w:spacing w:after="160"/>
       </w:pPr>
       <w:r>
-        <w:t>First, hallucinated numbers. The model states a value that is not in the data at all, like our 108 beats per minute. The fix is to always verify against the source.</w:t>
+        <w:t>Look at the timescale at the top. On the left, at around one to twenty milliseconds, is the PLC scan cycle. That is hard real time: interlocks, motion, safety, and the same answer every time. On the right, at seconds, are the language model agents we have discussed. They plan, write code, and explain. In the middle, between about 70 and 500 milliseconds, is a new class of models called decision models. One example is Jev, which a company called TypeSafe AI released in early access this September. A decision model does not write sentences. You give it the input and a fixed list of allowed answers, for example pass or reject, and it returns one answer together with a probability. The company trains these probabilities to be calibrated. That means when the model says 0.97, it should be right about 97 percent of the time. The speed numbers come from the company itself, so treat them as claims until someone reproduces them.</w:t>
       </w:r>
     </w:p>
     <w:p>
@@ -1230,7 +1238,7 @@
         <w:spacing w:after="160"/>
       </w:pPr>
       <w:r>
-        <w:t>Second, unit and scale errors. Millivolts versus volts, milliseconds versus seconds, decibels versus a linear ratio. A factor of a thousand looks very small in text. The fix is to state the unit in every single field you send.</w:t>
+        <w:t>Now look at the example at the bottom. It is a machine vision station, like the ones you build in this course. The camera takes a frame, the decision model looks at it, and it answers: this part has a defect, with probability 0.97. Then a simple rule decides what happens. If the probability is at least 0.95, the PLC rejects the part. If it is lower, the part goes to a human for a second look.</w:t>
       </w:r>
     </w:p>
     <w:p>
@@ -1238,23 +1246,7 @@
         <w:spacing w:after="160"/>
       </w:pPr>
       <w:r>
-        <w:t>Third, tokenization of digits. Remember that 3.14159 is split into pieces. That is why a language model can be unreliable at arithmetic when it does the arithmetic in text. The fix is to let code do the math.</w:t>
-      </w:r>
-    </w:p>
-    <w:p>
-      <w:pPr>
-        <w:spacing w:after="160"/>
-      </w:pPr>
-      <w:r>
-        <w:t>Fourth, context limits. A model can only read a limited amount of text at once, called its context window. A capture at 1 megasample per second gives you a million numbers every second, which is far too long to paste into a prompt. The fix is to summarize or use tools.</w:t>
-      </w:r>
-    </w:p>
-    <w:p>
-      <w:pPr>
-        <w:spacing w:after="160"/>
-      </w:pPr>
-      <w:r>
-        <w:t>Fifth, unsafe commands. If an agent sends a wrong setpoint to a power supply, it can damage your device under test or the instrument itself. The fix is an allowlist of permitted commands and hard limits enforced in code, so the model is physically unable to send something dangerous.</w:t>
+        <w:t>The important design choice is the sentence at the bottom. We treat the model's answer like one more sensor. The PLC still runs the loop, and the interlocks still apply. If the model is wrong, the worst case is a part in the wrong bin or an extra check by a person. The model alone can never make a machine move when it should not.</w:t>
       </w:r>
     </w:p>
     <w:p>
@@ -1265,7 +1257,7 @@
         <w:rPr>
           <w:color w:val="841617"/>
         </w:rPr>
-        <w:t>Slide 15: A checklist for using LLMs with measurements [2 minutes]</w:t>
+        <w:t>Slide 15: Pitfalls you will actually hit [3 minutes]</w:t>
       </w:r>
     </w:p>
     <w:p>
@@ -1284,7 +1276,7 @@
               <a:graphicData uri="http://schemas.openxmlformats.org/drawingml/2006/picture">
                 <pic:pic>
                   <pic:nvPicPr>
-                    <pic:cNvPr id="0" name="15-best-practices.jpg"/>
+                    <pic:cNvPr id="0" name="14-pitfalls.jpg"/>
                     <pic:cNvPicPr/>
                   </pic:nvPicPr>
                   <pic:blipFill>
@@ -1312,7 +1304,7 @@
         <w:spacing w:after="160"/>
       </w:pPr>
       <w:r>
-        <w:t>Here is a checklist you can take home. Give units, sample rate, and precision explicitly. Let code do the math: the FFT, the fits, and the statistics. Ask the model for code, then run it and read it yourself. Keep raw data out of the prompt and send summaries instead. Log the exact prompt and the model's answer, so you can find out later what went wrong. Cross check every number against the instrument. Enforce instrument limits in software. And a human approves anything that touches hardware.</w:t>
+        <w:t>If you start using these models in the lab, these are the five problems you will actually run into.</w:t>
       </w:r>
     </w:p>
     <w:p>
@@ -1320,7 +1312,39 @@
         <w:spacing w:after="160"/>
       </w:pPr>
       <w:r>
-        <w:t>Think about the last lab you did. Which of these would you have skipped? If you are honest, it is probably the logging, and that is exactly the one that saves you when something goes wrong.</w:t>
+        <w:t>First, hallucinated numbers. The model states a value that is not in the data at all, like our 108 beats per minute. The fix is to always verify against the source.</w:t>
+      </w:r>
+    </w:p>
+    <w:p>
+      <w:pPr>
+        <w:spacing w:after="160"/>
+      </w:pPr>
+      <w:r>
+        <w:t>Second, unit and scale errors. Millivolts versus volts, milliseconds versus seconds, decibels versus a linear ratio. A factor of a thousand looks very small in text. The fix is to state the unit in every single field you send.</w:t>
+      </w:r>
+    </w:p>
+    <w:p>
+      <w:pPr>
+        <w:spacing w:after="160"/>
+      </w:pPr>
+      <w:r>
+        <w:t>Third, tokenization of digits. Remember that 3.14159 is split into pieces. That is why a language model can be unreliable at arithmetic when it does the arithmetic in text. The fix is to let code do the math.</w:t>
+      </w:r>
+    </w:p>
+    <w:p>
+      <w:pPr>
+        <w:spacing w:after="160"/>
+      </w:pPr>
+      <w:r>
+        <w:t>Fourth, context limits. A model can only read a limited amount of text at once, called its context window. A capture at 1 megasample per second gives you a million numbers every second, which is far too long to paste into a prompt. The fix is to summarize or use tools.</w:t>
+      </w:r>
+    </w:p>
+    <w:p>
+      <w:pPr>
+        <w:spacing w:after="160"/>
+      </w:pPr>
+      <w:r>
+        <w:t>Fifth, unsafe commands. If an agent sends a wrong setpoint to a power supply, it can damage your device under test or the instrument itself. The fix is an allowlist of permitted commands and hard limits enforced in code, so the model is physically unable to send something dangerous.</w:t>
       </w:r>
     </w:p>
     <w:p>
@@ -1331,7 +1355,7 @@
         <w:rPr>
           <w:color w:val="841617"/>
         </w:rPr>
-        <w:t>Slide 16: Summary [1.5 minutes]</w:t>
+        <w:t>Slide 16: A checklist for using LLMs with measurements [2 minutes]</w:t>
       </w:r>
     </w:p>
     <w:p>
@@ -1350,7 +1374,7 @@
               <a:graphicData uri="http://schemas.openxmlformats.org/drawingml/2006/picture">
                 <pic:pic>
                   <pic:nvPicPr>
-                    <pic:cNvPr id="0" name="16-summary.jpg"/>
+                    <pic:cNvPr id="0" name="15-best-practices.jpg"/>
                     <pic:cNvPicPr/>
                   </pic:nvPicPr>
                   <pic:blipFill>
@@ -1378,7 +1402,7 @@
         <w:spacing w:after="160"/>
       </w:pPr>
       <w:r>
-        <w:t>Let me bring it all together in three sentences.</w:t>
+        <w:t>Here is a checklist you can take home. Give units, sample rate, and precision explicitly. Let code do the math: the FFT, the fits, and the statistics. Ask the model for code, then run it and read it yourself. Keep raw data out of the prompt and send summaries instead. Log the exact prompt and the model's answer, so you can find out later what went wrong. Cross check every number against the instrument. Enforce instrument limits in software. And a human approves anything that touches hardware.</w:t>
       </w:r>
     </w:p>
     <w:p>
@@ -1386,23 +1410,7 @@
         <w:spacing w:after="160"/>
       </w:pPr>
       <w:r>
-        <w:t>One: a language model predicts the next token, P of x t given everything before it. Every behavior you see comes from that single loop.</w:t>
-      </w:r>
-    </w:p>
-    <w:p>
-      <w:pPr>
-        <w:spacing w:after="160"/>
-      </w:pPr>
-      <w:r>
-        <w:t>Two: it sees your sine wave as text, not as volts and seconds. It can continue a clean pattern, but it does not understand the physics, the units, or the time base unless you give them to it, and it can misread numbers even when they are right there.</w:t>
-      </w:r>
-    </w:p>
-    <w:p>
-      <w:pPr>
-        <w:spacing w:after="160"/>
-      </w:pPr>
-      <w:r>
-        <w:t>Three: the best use in the lab is to let it plan, write code, call instruments, and explain. Let the tools do the measuring.</w:t>
+        <w:t>Think about the last lab you did. Which of these would you have skipped? If you are honest, it is probably the logging, and that is exactly the one that saves you when something goes wrong.</w:t>
       </w:r>
     </w:p>
     <w:p>
@@ -1413,7 +1421,7 @@
         <w:rPr>
           <w:color w:val="841617"/>
         </w:rPr>
-        <w:t>Slide 17: Questions, and join the LLM Engineering Club [remaining time]</w:t>
+        <w:t>Slide 17: Summary [1.5 minutes]</w:t>
       </w:r>
     </w:p>
     <w:p>
@@ -1432,11 +1440,93 @@
               <a:graphicData uri="http://schemas.openxmlformats.org/drawingml/2006/picture">
                 <pic:pic>
                   <pic:nvPicPr>
+                    <pic:cNvPr id="0" name="16-summary.jpg"/>
+                    <pic:cNvPicPr/>
+                  </pic:nvPicPr>
+                  <pic:blipFill>
+                    <a:blip r:embed="rId25"/>
+                    <a:stretch>
+                      <a:fillRect/>
+                    </a:stretch>
+                  </pic:blipFill>
+                  <pic:spPr>
+                    <a:xfrm>
+                      <a:off x="0" y="0"/>
+                      <a:ext cx="3840480" cy="2161418"/>
+                    </a:xfrm>
+                    <a:prstGeom prst="rect"/>
+                  </pic:spPr>
+                </pic:pic>
+              </a:graphicData>
+            </a:graphic>
+          </wp:inline>
+        </w:drawing>
+      </w:r>
+    </w:p>
+    <w:p>
+      <w:pPr>
+        <w:spacing w:after="160"/>
+      </w:pPr>
+      <w:r>
+        <w:t>Let me bring it all together in three sentences.</w:t>
+      </w:r>
+    </w:p>
+    <w:p>
+      <w:pPr>
+        <w:spacing w:after="160"/>
+      </w:pPr>
+      <w:r>
+        <w:t>One: a language model predicts the next token, P of x t given everything before it. Every behavior you see comes from that single loop.</w:t>
+      </w:r>
+    </w:p>
+    <w:p>
+      <w:pPr>
+        <w:spacing w:after="160"/>
+      </w:pPr>
+      <w:r>
+        <w:t>Two: it sees your sine wave as text, not as volts and seconds. It can continue a clean pattern, but it does not understand the physics, the units, or the time base unless you give them to it, and it can misread numbers even when they are right there.</w:t>
+      </w:r>
+    </w:p>
+    <w:p>
+      <w:pPr>
+        <w:spacing w:after="160"/>
+      </w:pPr>
+      <w:r>
+        <w:t>Three: the best use in the lab is to let it plan, write code, call instruments, and explain. Let the tools do the measuring.</w:t>
+      </w:r>
+    </w:p>
+    <w:p>
+      <w:pPr>
+        <w:pStyle w:val="Heading1"/>
+      </w:pPr>
+      <w:r>
+        <w:rPr>
+          <w:color w:val="841617"/>
+        </w:rPr>
+        <w:t>Slide 18: Questions, and join the LLM Engineering Club [remaining time]</w:t>
+      </w:r>
+    </w:p>
+    <w:p>
+      <w:pPr>
+        <w:jc w:val="center"/>
+      </w:pPr>
+      <w:r>
+        <w:drawing>
+          <wp:inline xmlns:a="http://schemas.openxmlformats.org/drawingml/2006/main" xmlns:pic="http://schemas.openxmlformats.org/drawingml/2006/picture">
+            <wp:extent cx="3840480" cy="2161418"/>
+            <wp:docPr id="18" name="Picture 18"/>
+            <wp:cNvGraphicFramePr>
+              <a:graphicFrameLocks noChangeAspect="1"/>
+            </wp:cNvGraphicFramePr>
+            <a:graphic>
+              <a:graphicData uri="http://schemas.openxmlformats.org/drawingml/2006/picture">
+                <pic:pic>
+                  <pic:nvPicPr>
                     <pic:cNvPr id="0" name="17-questions.jpg"/>
                     <pic:cNvPicPr/>
                   </pic:nvPicPr>
                   <pic:blipFill>
-                    <a:blip r:embed="rId25"/>
+                    <a:blip r:embed="rId26"/>
                     <a:stretch>
                       <a:fillRect/>
                     </a:stretch>

</xml_diff>